<commit_message>
THis is a test
</commit_message>
<xml_diff>
--- a/hello.docx
+++ b/hello.docx
@@ -4,7 +4,18 @@
   <w:body>
     <w:p>
       <w:r>
-        <w:t>one</w:t>
+        <w:t>O</w:t>
+      </w:r>
+      <w:r>
+        <w:t>ne</w:t>
+      </w:r>
+      <w:r>
+        <w:t xml:space="preserve"> two three</w:t>
+      </w:r>
+    </w:p>
+    <w:p>
+      <w:r>
+        <w:t>One again</w:t>
       </w:r>
       <w:bookmarkStart w:id="0" w:name="_GoBack"/>
       <w:bookmarkEnd w:id="0"/>

</xml_diff>